<commit_message>
few changes in it
</commit_message>
<xml_diff>
--- a/Rahma_25021519-239.docx
+++ b/Rahma_25021519-239.docx
@@ -4,21 +4,487 @@
   <w:body>
     <w:p>
       <w:pPr>
-        <w:spacing w:line="360" w:lineRule="auto"/>
+        <w:pBdr>
+          <w:bottom w:val="single" w:sz="24" w:space="1" w:color="auto"/>
+        </w:pBdr>
+        <w:rPr>
+          <w:rFonts w:ascii="Britannic Bold" w:hAnsi="Britannic Bold" w:cs="Cavolini"/>
+          <w:color w:val="002060"/>
+          <w:sz w:val="40"/>
+          <w:szCs w:val="40"/>
+        </w:rPr>
+      </w:pPr>
+    </w:p>
+    <w:p>
+      <w:pPr>
+        <w:pBdr>
+          <w:bottom w:val="single" w:sz="24" w:space="1" w:color="auto"/>
+        </w:pBdr>
+        <w:rPr>
+          <w:rFonts w:ascii="Britannic Bold" w:hAnsi="Britannic Bold" w:cs="Cavolini"/>
+          <w:color w:val="002060"/>
+          <w:sz w:val="44"/>
+          <w:szCs w:val="44"/>
+        </w:rPr>
+      </w:pPr>
+      <w:r>
+        <w:rPr>
+          <w:rFonts w:ascii="Britannic Bold" w:hAnsi="Britannic Bold" w:cs="Cavolini"/>
+          <w:color w:val="002060"/>
+          <w:sz w:val="44"/>
+          <w:szCs w:val="44"/>
+        </w:rPr>
+        <w:t xml:space="preserve">   </w:t>
+      </w:r>
+      <w:r>
+        <w:rPr>
+          <w:rFonts w:ascii="Britannic Bold" w:hAnsi="Britannic Bold" w:cs="Cavolini"/>
+          <w:color w:val="002060"/>
+          <w:sz w:val="44"/>
+          <w:szCs w:val="44"/>
+        </w:rPr>
+        <w:t xml:space="preserve">Constructors, Destructors &amp; Object Lifecycle  </w:t>
+      </w:r>
+    </w:p>
+    <w:p>
+      <w:pPr>
+        <w:rPr>
+          <w:rFonts w:ascii="Britannic Bold" w:hAnsi="Britannic Bold"/>
+          <w:color w:val="BF4E14" w:themeColor="accent2" w:themeShade="BF"/>
+          <w:sz w:val="32"/>
+          <w:szCs w:val="32"/>
+        </w:rPr>
+      </w:pPr>
+    </w:p>
+    <w:p>
+      <w:pPr>
         <w:jc w:val="center"/>
         <w:rPr>
-          <w:b/>
-          <w:bCs/>
+          <w:rFonts w:ascii="Britannic Bold" w:hAnsi="Britannic Bold"/>
+          <w:color w:val="BF4E14" w:themeColor="accent2" w:themeShade="BF"/>
+          <w:sz w:val="32"/>
+          <w:szCs w:val="32"/>
+        </w:rPr>
+      </w:pPr>
+      <w:r>
+        <w:rPr>
+          <w:rFonts w:ascii="Britannic Bold" w:hAnsi="Britannic Bold"/>
+          <w:color w:val="BF4E14" w:themeColor="accent2" w:themeShade="BF"/>
+          <w:sz w:val="32"/>
+          <w:szCs w:val="32"/>
+        </w:rPr>
+        <w:t>NAME : RAHMA NOOR</w:t>
+      </w:r>
+    </w:p>
+    <w:p>
+      <w:pPr>
+        <w:jc w:val="center"/>
+        <w:rPr>
+          <w:rFonts w:ascii="Britannic Bold" w:hAnsi="Britannic Bold"/>
+          <w:color w:val="BF4E14" w:themeColor="accent2" w:themeShade="BF"/>
+          <w:sz w:val="32"/>
+          <w:szCs w:val="32"/>
+        </w:rPr>
+      </w:pPr>
+      <w:r>
+        <w:rPr>
+          <w:rFonts w:ascii="Britannic Bold" w:hAnsi="Britannic Bold"/>
+          <w:color w:val="BF4E14" w:themeColor="accent2" w:themeShade="BF"/>
+          <w:sz w:val="32"/>
+          <w:szCs w:val="32"/>
+        </w:rPr>
+        <w:t>LAB TASK</w:t>
+      </w:r>
+      <w:r>
+        <w:rPr>
+          <w:rFonts w:ascii="Britannic Bold" w:hAnsi="Britannic Bold"/>
+          <w:color w:val="BF4E14" w:themeColor="accent2" w:themeShade="BF"/>
+          <w:sz w:val="32"/>
+          <w:szCs w:val="32"/>
+        </w:rPr>
+        <w:t xml:space="preserve"> BY: </w:t>
+      </w:r>
+      <w:r>
+        <w:rPr>
+          <w:rFonts w:ascii="Britannic Bold" w:hAnsi="Britannic Bold"/>
+          <w:color w:val="BF4E14" w:themeColor="accent2" w:themeShade="BF"/>
+          <w:sz w:val="32"/>
+          <w:szCs w:val="32"/>
+        </w:rPr>
+        <w:t>2501519-239</w:t>
+      </w:r>
+    </w:p>
+    <w:p>
+      <w:pPr>
+        <w:jc w:val="center"/>
+        <w:rPr>
+          <w:rFonts w:ascii="Britannic Bold" w:hAnsi="Britannic Bold"/>
+          <w:sz w:val="32"/>
+          <w:szCs w:val="32"/>
+        </w:rPr>
+      </w:pPr>
+      <w:r>
+        <w:rPr>
+          <w:rFonts w:ascii="Britannic Bold" w:hAnsi="Britannic Bold"/>
+          <w:color w:val="BF4E14" w:themeColor="accent2" w:themeShade="BF"/>
+          <w:sz w:val="32"/>
+          <w:szCs w:val="32"/>
+        </w:rPr>
+        <w:t>SUBMITTED TO:</w:t>
+      </w:r>
+      <w:r>
+        <w:rPr>
+          <w:rFonts w:ascii="Britannic Bold" w:hAnsi="Britannic Bold"/>
+          <w:color w:val="BF4E14" w:themeColor="accent2" w:themeShade="BF"/>
+          <w:sz w:val="32"/>
+          <w:szCs w:val="32"/>
+        </w:rPr>
+        <w:t xml:space="preserve"> </w:t>
+      </w:r>
+      <w:r>
+        <w:rPr>
+          <w:rFonts w:ascii="Britannic Bold" w:hAnsi="Britannic Bold"/>
+          <w:color w:val="BF4E14" w:themeColor="accent2" w:themeShade="BF"/>
+          <w:sz w:val="32"/>
+          <w:szCs w:val="32"/>
+        </w:rPr>
+        <w:t>RANA FAIZAN ALI</w:t>
+      </w:r>
+    </w:p>
+    <w:p>
+      <w:pPr>
+        <w:jc w:val="center"/>
+        <w:rPr>
+          <w:rFonts w:ascii="Britannic Bold" w:hAnsi="Britannic Bold"/>
           <w:sz w:val="28"/>
           <w:szCs w:val="28"/>
         </w:rPr>
       </w:pPr>
       <w:r>
         <w:rPr>
-          <w:b/>
-          <w:bCs/>
+          <w:rFonts w:ascii="Britannic Bold" w:hAnsi="Britannic Bold"/>
+          <w:noProof/>
           <w:sz w:val="28"/>
           <w:szCs w:val="28"/>
+        </w:rPr>
+        <w:drawing>
+          <wp:inline distT="0" distB="0" distL="0" distR="0" wp14:anchorId="02041016" wp14:editId="70E9DBD4">
+            <wp:extent cx="2863850" cy="2149540"/>
+            <wp:effectExtent l="304800" t="304800" r="317500" b="327025"/>
+            <wp:docPr id="1827414814" name="Picture 3"/>
+            <wp:cNvGraphicFramePr>
+              <a:graphicFrameLocks xmlns:a="http://schemas.openxmlformats.org/drawingml/2006/main" noChangeAspect="1"/>
+            </wp:cNvGraphicFramePr>
+            <a:graphic xmlns:a="http://schemas.openxmlformats.org/drawingml/2006/main">
+              <a:graphicData uri="http://schemas.openxmlformats.org/drawingml/2006/picture">
+                <pic:pic xmlns:pic="http://schemas.openxmlformats.org/drawingml/2006/picture">
+                  <pic:nvPicPr>
+                    <pic:cNvPr id="0" name="Picture 4"/>
+                    <pic:cNvPicPr>
+                      <a:picLocks noChangeAspect="1" noChangeArrowheads="1"/>
+                    </pic:cNvPicPr>
+                  </pic:nvPicPr>
+                  <pic:blipFill>
+                    <a:blip r:embed="rId5" cstate="print">
+                      <a:extLst>
+                        <a:ext uri="{28A0092B-C50C-407E-A947-70E740481C1C}">
+                          <a14:useLocalDpi xmlns:a14="http://schemas.microsoft.com/office/drawing/2010/main" val="0"/>
+                        </a:ext>
+                      </a:extLst>
+                    </a:blip>
+                    <a:srcRect/>
+                    <a:stretch>
+                      <a:fillRect/>
+                    </a:stretch>
+                  </pic:blipFill>
+                  <pic:spPr bwMode="auto">
+                    <a:xfrm>
+                      <a:off x="0" y="0"/>
+                      <a:ext cx="2875675" cy="2158415"/>
+                    </a:xfrm>
+                    <a:prstGeom prst="round2DiagRect">
+                      <a:avLst>
+                        <a:gd name="adj1" fmla="val 16667"/>
+                        <a:gd name="adj2" fmla="val 0"/>
+                      </a:avLst>
+                    </a:prstGeom>
+                    <a:ln w="88900" cap="sq">
+                      <a:solidFill>
+                        <a:srgbClr val="FFFFFF"/>
+                      </a:solidFill>
+                      <a:miter lim="800000"/>
+                    </a:ln>
+                    <a:effectLst>
+                      <a:outerShdw blurRad="254000" algn="tl" rotWithShape="0">
+                        <a:srgbClr val="0E2841">
+                          <a:alpha val="43000"/>
+                        </a:srgbClr>
+                      </a:outerShdw>
+                    </a:effectLst>
+                  </pic:spPr>
+                </pic:pic>
+              </a:graphicData>
+            </a:graphic>
+          </wp:inline>
+        </w:drawing>
+      </w:r>
+    </w:p>
+    <w:p>
+      <w:pPr>
+        <w:jc w:val="center"/>
+        <w:rPr>
+          <w:rFonts w:ascii="Britannic Bold" w:hAnsi="Britannic Bold"/>
+          <w:color w:val="BF4E14" w:themeColor="accent2" w:themeShade="BF"/>
+          <w:sz w:val="32"/>
+          <w:szCs w:val="32"/>
+        </w:rPr>
+      </w:pPr>
+      <w:r>
+        <w:rPr>
+          <w:rFonts w:ascii="Britannic Bold" w:hAnsi="Britannic Bold"/>
+          <w:color w:val="BF4E14" w:themeColor="accent2" w:themeShade="BF"/>
+          <w:sz w:val="32"/>
+          <w:szCs w:val="32"/>
+        </w:rPr>
+        <w:t xml:space="preserve">COURSE </w:t>
+      </w:r>
+      <w:r>
+        <w:rPr>
+          <w:rFonts w:ascii="Britannic Bold" w:hAnsi="Britannic Bold"/>
+          <w:color w:val="BF4E14" w:themeColor="accent2" w:themeShade="BF"/>
+          <w:sz w:val="32"/>
+          <w:szCs w:val="32"/>
+        </w:rPr>
+        <w:t>: OOP LAB</w:t>
+      </w:r>
+    </w:p>
+    <w:p>
+      <w:pPr>
+        <w:jc w:val="center"/>
+        <w:rPr>
+          <w:rFonts w:ascii="Britannic Bold" w:hAnsi="Britannic Bold"/>
+          <w:color w:val="BF4E14" w:themeColor="accent2" w:themeShade="BF"/>
+          <w:sz w:val="32"/>
+          <w:szCs w:val="32"/>
+        </w:rPr>
+      </w:pPr>
+      <w:r>
+        <w:rPr>
+          <w:rFonts w:ascii="Britannic Bold" w:hAnsi="Britannic Bold"/>
+          <w:color w:val="BF4E14" w:themeColor="accent2" w:themeShade="BF"/>
+          <w:sz w:val="32"/>
+          <w:szCs w:val="32"/>
+        </w:rPr>
+        <w:t xml:space="preserve">SEMESTER AND SESSION: </w:t>
+      </w:r>
+      <w:r>
+        <w:rPr>
+          <w:rFonts w:ascii="Britannic Bold" w:hAnsi="Britannic Bold"/>
+          <w:color w:val="BF4E14" w:themeColor="accent2" w:themeShade="BF"/>
+          <w:sz w:val="32"/>
+          <w:szCs w:val="32"/>
+        </w:rPr>
+        <w:t>2</w:t>
+      </w:r>
+      <w:r>
+        <w:rPr>
+          <w:rFonts w:ascii="Britannic Bold" w:hAnsi="Britannic Bold"/>
+          <w:color w:val="BF4E14" w:themeColor="accent2" w:themeShade="BF"/>
+          <w:sz w:val="32"/>
+          <w:szCs w:val="32"/>
+          <w:vertAlign w:val="superscript"/>
+        </w:rPr>
+        <w:t>nd</w:t>
+      </w:r>
+      <w:r>
+        <w:rPr>
+          <w:rFonts w:ascii="Britannic Bold" w:hAnsi="Britannic Bold"/>
+          <w:color w:val="BF4E14" w:themeColor="accent2" w:themeShade="BF"/>
+          <w:sz w:val="32"/>
+          <w:szCs w:val="32"/>
+        </w:rPr>
+        <w:t>(2025-2029)</w:t>
+      </w:r>
+    </w:p>
+    <w:p>
+      <w:pPr>
+        <w:jc w:val="center"/>
+        <w:rPr>
+          <w:rFonts w:ascii="Britannic Bold" w:hAnsi="Britannic Bold"/>
+          <w:color w:val="BF4E14" w:themeColor="accent2" w:themeShade="BF"/>
+          <w:sz w:val="32"/>
+          <w:szCs w:val="32"/>
+        </w:rPr>
+      </w:pPr>
+      <w:r>
+        <w:rPr>
+          <w:rFonts w:ascii="Britannic Bold" w:hAnsi="Britannic Bold"/>
+          <w:color w:val="BF4E14" w:themeColor="accent2" w:themeShade="BF"/>
+          <w:sz w:val="32"/>
+          <w:szCs w:val="32"/>
+        </w:rPr>
+        <w:t xml:space="preserve">SUBMISSION DATE: </w:t>
+      </w:r>
+      <w:r>
+        <w:rPr>
+          <w:rFonts w:ascii="Britannic Bold" w:hAnsi="Britannic Bold"/>
+          <w:color w:val="BF4E14" w:themeColor="accent2" w:themeShade="BF"/>
+          <w:sz w:val="32"/>
+          <w:szCs w:val="32"/>
+        </w:rPr>
+        <w:t>0</w:t>
+      </w:r>
+      <w:r>
+        <w:rPr>
+          <w:rFonts w:ascii="Britannic Bold" w:hAnsi="Britannic Bold"/>
+          <w:color w:val="BF4E14" w:themeColor="accent2" w:themeShade="BF"/>
+          <w:sz w:val="32"/>
+          <w:szCs w:val="32"/>
+        </w:rPr>
+        <w:t>2</w:t>
+      </w:r>
+      <w:r>
+        <w:rPr>
+          <w:rFonts w:ascii="Britannic Bold" w:hAnsi="Britannic Bold"/>
+          <w:color w:val="BF4E14" w:themeColor="accent2" w:themeShade="BF"/>
+          <w:sz w:val="32"/>
+          <w:szCs w:val="32"/>
+        </w:rPr>
+        <w:t>.</w:t>
+      </w:r>
+      <w:r>
+        <w:rPr>
+          <w:rFonts w:ascii="Britannic Bold" w:hAnsi="Britannic Bold"/>
+          <w:color w:val="BF4E14" w:themeColor="accent2" w:themeShade="BF"/>
+          <w:sz w:val="32"/>
+          <w:szCs w:val="32"/>
+        </w:rPr>
+        <w:t>03</w:t>
+      </w:r>
+      <w:r>
+        <w:rPr>
+          <w:rFonts w:ascii="Britannic Bold" w:hAnsi="Britannic Bold"/>
+          <w:color w:val="BF4E14" w:themeColor="accent2" w:themeShade="BF"/>
+          <w:sz w:val="32"/>
+          <w:szCs w:val="32"/>
+        </w:rPr>
+        <w:t>.202</w:t>
+      </w:r>
+      <w:r>
+        <w:rPr>
+          <w:rFonts w:ascii="Britannic Bold" w:hAnsi="Britannic Bold"/>
+          <w:color w:val="BF4E14" w:themeColor="accent2" w:themeShade="BF"/>
+          <w:sz w:val="32"/>
+          <w:szCs w:val="32"/>
+        </w:rPr>
+        <w:t>6</w:t>
+      </w:r>
+    </w:p>
+    <w:p>
+      <w:pPr>
+        <w:rPr>
+          <w:rFonts w:ascii="Britannic Bold" w:hAnsi="Britannic Bold"/>
+          <w:color w:val="BF4E14" w:themeColor="accent2" w:themeShade="BF"/>
+          <w:sz w:val="32"/>
+          <w:szCs w:val="32"/>
+        </w:rPr>
+      </w:pPr>
+    </w:p>
+    <w:p>
+      <w:pPr>
+        <w:pBdr>
+          <w:top w:val="single" w:sz="24" w:space="1" w:color="auto"/>
+        </w:pBdr>
+        <w:jc w:val="center"/>
+        <w:rPr>
+          <w:rFonts w:ascii="Britannic Bold" w:hAnsi="Britannic Bold"/>
+          <w:color w:val="002060"/>
+          <w:sz w:val="36"/>
+          <w:szCs w:val="36"/>
+        </w:rPr>
+      </w:pPr>
+    </w:p>
+    <w:p>
+      <w:pPr>
+        <w:jc w:val="center"/>
+        <w:rPr>
+          <w:rFonts w:ascii="Britannic Bold" w:hAnsi="Britannic Bold"/>
+          <w:color w:val="002060"/>
+          <w:sz w:val="36"/>
+          <w:szCs w:val="36"/>
+        </w:rPr>
+      </w:pPr>
+      <w:r>
+        <w:rPr>
+          <w:rFonts w:ascii="Britannic Bold" w:hAnsi="Britannic Bold"/>
+          <w:color w:val="002060"/>
+          <w:sz w:val="36"/>
+          <w:szCs w:val="36"/>
+        </w:rPr>
+        <w:t>DEPARTMENT OF COMPUTER SCIENCE</w:t>
+      </w:r>
+    </w:p>
+    <w:p>
+      <w:pPr>
+        <w:jc w:val="center"/>
+        <w:rPr>
+          <w:rFonts w:ascii="Britannic Bold" w:hAnsi="Britannic Bold"/>
+          <w:color w:val="002060"/>
+          <w:sz w:val="36"/>
+          <w:szCs w:val="36"/>
+        </w:rPr>
+      </w:pPr>
+      <w:r>
+        <w:rPr>
+          <w:rFonts w:ascii="Britannic Bold" w:hAnsi="Britannic Bold"/>
+          <w:color w:val="002060"/>
+          <w:sz w:val="36"/>
+          <w:szCs w:val="36"/>
+        </w:rPr>
+        <w:t>UNIVERSITY OF GUJRAT</w:t>
+      </w:r>
+    </w:p>
+    <w:p>
+      <w:pPr>
+        <w:spacing w:line="360" w:lineRule="auto"/>
+        <w:jc w:val="center"/>
+        <w:rPr>
+          <w:b/>
+          <w:bCs/>
+          <w:sz w:val="28"/>
+          <w:szCs w:val="28"/>
+        </w:rPr>
+      </w:pPr>
+    </w:p>
+    <w:p>
+      <w:pPr>
+        <w:spacing w:line="360" w:lineRule="auto"/>
+        <w:jc w:val="center"/>
+        <w:rPr>
+          <w:b/>
+          <w:bCs/>
+          <w:sz w:val="28"/>
+          <w:szCs w:val="28"/>
+        </w:rPr>
+      </w:pPr>
+    </w:p>
+    <w:p>
+      <w:pPr>
+        <w:spacing w:line="360" w:lineRule="auto"/>
+        <w:jc w:val="center"/>
+        <w:rPr>
+          <w:b/>
+          <w:bCs/>
+          <w:sz w:val="32"/>
+          <w:szCs w:val="32"/>
+        </w:rPr>
+      </w:pPr>
+      <w:r>
+        <w:rPr>
+          <w:b/>
+          <w:bCs/>
+          <w:sz w:val="32"/>
+          <w:szCs w:val="32"/>
         </w:rPr>
         <w:t>Task 1: LIFO Behavior on Stack</w:t>
       </w:r>
@@ -90,7 +556,7 @@
                     </pic:cNvPicPr>
                   </pic:nvPicPr>
                   <pic:blipFill>
-                    <a:blip r:embed="rId5">
+                    <a:blip r:embed="rId6">
                       <a:extLst>
                         <a:ext uri="{28A0092B-C50C-407E-A947-70E740481C1C}">
                           <a14:useLocalDpi xmlns:a14="http://schemas.microsoft.com/office/drawing/2010/main" val="0"/>
@@ -131,6 +597,7 @@
         <w:rPr>
           <w:noProof/>
         </w:rPr>
+        <w:lastRenderedPageBreak/>
         <w:drawing>
           <wp:inline distT="0" distB="0" distL="0" distR="0" wp14:anchorId="75410270" wp14:editId="500048D6">
             <wp:extent cx="5230690" cy="1424791"/>
@@ -149,7 +616,7 @@
                     </pic:cNvPicPr>
                   </pic:nvPicPr>
                   <pic:blipFill>
-                    <a:blip r:embed="rId6">
+                    <a:blip r:embed="rId7">
                       <a:extLst>
                         <a:ext uri="{28A0092B-C50C-407E-A947-70E740481C1C}">
                           <a14:useLocalDpi xmlns:a14="http://schemas.microsoft.com/office/drawing/2010/main" val="0"/>
@@ -197,7 +664,6 @@
           <w:b/>
           <w:bCs/>
         </w:rPr>
-        <w:lastRenderedPageBreak/>
         <w:t>Q1: Write the exact constructor and destructor execution order.</w:t>
       </w:r>
     </w:p>
@@ -320,7 +786,15 @@
         <w:spacing w:line="360" w:lineRule="auto"/>
       </w:pPr>
       <w:r>
-        <w:t>This shows that objects inside inner are destroyed before the object in outer.</w:t>
+        <w:t xml:space="preserve">This shows that objects inside </w:t>
+      </w:r>
+      <w:proofErr w:type="gramStart"/>
+      <w:r>
+        <w:t>inner</w:t>
+      </w:r>
+      <w:proofErr w:type="gramEnd"/>
+      <w:r>
+        <w:t xml:space="preserve"> are destroyed before the object in outer.</w:t>
       </w:r>
     </w:p>
     <w:p>
@@ -448,6 +922,7 @@
         <w:spacing w:line="360" w:lineRule="auto"/>
       </w:pPr>
       <w:r>
+        <w:lastRenderedPageBreak/>
         <w:t>In simple words, stack objects are destroyed automatically when they go out of scope.</w:t>
       </w:r>
     </w:p>
@@ -461,57 +936,88 @@
         <w:rPr>
           <w:b/>
           <w:bCs/>
+          <w:sz w:val="32"/>
+          <w:szCs w:val="32"/>
+        </w:rPr>
+      </w:pPr>
+      <w:r>
+        <w:rPr>
+          <w:b/>
+          <w:bCs/>
+          <w:sz w:val="32"/>
+          <w:szCs w:val="32"/>
+        </w:rPr>
+        <w:t>Task 2: Stack vs Heap Comparison</w:t>
+      </w:r>
+    </w:p>
+    <w:p>
+      <w:pPr>
+        <w:tabs>
+          <w:tab w:val="left" w:pos="7410"/>
+        </w:tabs>
+        <w:spacing w:line="360" w:lineRule="auto"/>
+        <w:rPr>
+          <w:b/>
+          <w:bCs/>
+        </w:rPr>
+      </w:pPr>
+      <w:r>
+        <w:rPr>
+          <w:b/>
+          <w:bCs/>
+        </w:rPr>
+        <w:t xml:space="preserve">Create a class Memory Check with constructors, destructors, and a method to print the object address using </w:t>
+      </w:r>
+      <w:proofErr w:type="gramStart"/>
+      <w:r>
+        <w:rPr>
+          <w:b/>
+          <w:bCs/>
+        </w:rPr>
+        <w:t>the this</w:t>
+      </w:r>
+      <w:proofErr w:type="gramEnd"/>
+      <w:r>
+        <w:rPr>
+          <w:b/>
+          <w:bCs/>
+        </w:rPr>
+        <w:t xml:space="preserve"> pointer. Create objects on both the stack and the heap. Delete only one heap object.</w:t>
+      </w:r>
+    </w:p>
+    <w:p>
+      <w:pPr>
+        <w:tabs>
+          <w:tab w:val="left" w:pos="7410"/>
+        </w:tabs>
+        <w:spacing w:line="360" w:lineRule="auto"/>
+        <w:rPr>
           <w:sz w:val="28"/>
           <w:szCs w:val="28"/>
         </w:rPr>
       </w:pPr>
       <w:r>
         <w:rPr>
-          <w:b/>
-          <w:bCs/>
           <w:sz w:val="28"/>
           <w:szCs w:val="28"/>
         </w:rPr>
-        <w:t>Task 2: Stack vs Heap Comparison</w:t>
-      </w:r>
-    </w:p>
-    <w:p>
-      <w:pPr>
-        <w:tabs>
-          <w:tab w:val="left" w:pos="7410"/>
-        </w:tabs>
-        <w:spacing w:line="360" w:lineRule="auto"/>
-        <w:rPr>
-          <w:b/>
-          <w:bCs/>
-        </w:rPr>
-      </w:pPr>
-      <w:r>
-        <w:rPr>
-          <w:b/>
-          <w:bCs/>
-        </w:rPr>
-        <w:t>Create a class Memory Check with constructors, destructors, and a method to print the object address using the this pointer. Create objects on both the stack and the heap. Delete only one heap object.</w:t>
-      </w:r>
-    </w:p>
-    <w:p>
-      <w:pPr>
-        <w:tabs>
-          <w:tab w:val="left" w:pos="7410"/>
-        </w:tabs>
-        <w:spacing w:line="360" w:lineRule="auto"/>
+        <w:t xml:space="preserve">• Implement class </w:t>
+      </w:r>
+      <w:proofErr w:type="spellStart"/>
+      <w:r>
         <w:rPr>
           <w:sz w:val="28"/>
           <w:szCs w:val="28"/>
         </w:rPr>
-      </w:pPr>
+        <w:t>MemoryCheck</w:t>
+      </w:r>
+      <w:proofErr w:type="spellEnd"/>
       <w:r>
         <w:rPr>
           <w:sz w:val="28"/>
           <w:szCs w:val="28"/>
         </w:rPr>
-        <w:lastRenderedPageBreak/>
-        <w:t>• Implement class MemoryCheck with constructors, destructor, and address printing.</w:t>
+        <w:t xml:space="preserve"> with constructors, destructor, and address printing.</w:t>
       </w:r>
     </w:p>
     <w:p>
@@ -599,7 +1105,7 @@
                     </pic:cNvPicPr>
                   </pic:nvPicPr>
                   <pic:blipFill>
-                    <a:blip r:embed="rId7">
+                    <a:blip r:embed="rId8">
                       <a:extLst>
                         <a:ext uri="{28A0092B-C50C-407E-A947-70E740481C1C}">
                           <a14:useLocalDpi xmlns:a14="http://schemas.microsoft.com/office/drawing/2010/main" val="0"/>
@@ -649,6 +1155,7 @@
         <w:rPr>
           <w:noProof/>
         </w:rPr>
+        <w:lastRenderedPageBreak/>
         <w:drawing>
           <wp:inline distT="0" distB="0" distL="0" distR="0" wp14:anchorId="3453A3BC" wp14:editId="75A87C52">
             <wp:extent cx="4712970" cy="1976120"/>
@@ -667,7 +1174,7 @@
                     </pic:cNvPicPr>
                   </pic:nvPicPr>
                   <pic:blipFill>
-                    <a:blip r:embed="rId8">
+                    <a:blip r:embed="rId9">
                       <a:extLst>
                         <a:ext uri="{28A0092B-C50C-407E-A947-70E740481C1C}">
                           <a14:useLocalDpi xmlns:a14="http://schemas.microsoft.com/office/drawing/2010/main" val="0"/>
@@ -719,7 +1226,6 @@
           <w:sz w:val="28"/>
           <w:szCs w:val="28"/>
         </w:rPr>
-        <w:lastRenderedPageBreak/>
         <w:t>Questions:</w:t>
       </w:r>
     </w:p>
@@ -1047,19 +1553,37 @@
         <w:rPr>
           <w:b/>
           <w:bCs/>
+          <w:sz w:val="32"/>
+          <w:szCs w:val="32"/>
+        </w:rPr>
+      </w:pPr>
+      <w:r>
+        <w:rPr>
+          <w:b/>
+          <w:bCs/>
+          <w:sz w:val="32"/>
+          <w:szCs w:val="32"/>
+        </w:rPr>
+        <w:lastRenderedPageBreak/>
+        <w:t>Task 3: Copy Constructor Analysis</w:t>
+      </w:r>
+    </w:p>
+    <w:p>
+      <w:pPr>
+        <w:pStyle w:val="ListParagraph"/>
+        <w:tabs>
+          <w:tab w:val="left" w:pos="7410"/>
+        </w:tabs>
+        <w:spacing w:line="360" w:lineRule="auto"/>
+        <w:ind w:left="410"/>
+        <w:jc w:val="center"/>
+        <w:rPr>
+          <w:b/>
+          <w:bCs/>
           <w:sz w:val="28"/>
           <w:szCs w:val="28"/>
         </w:rPr>
       </w:pPr>
-      <w:r>
-        <w:rPr>
-          <w:b/>
-          <w:bCs/>
-          <w:sz w:val="28"/>
-          <w:szCs w:val="28"/>
-        </w:rPr>
-        <w:t>Task 3: Copy Constructor Analysis</w:t>
-      </w:r>
     </w:p>
     <w:p>
       <w:pPr>
@@ -1069,14 +1593,18 @@
         </w:tabs>
         <w:spacing w:line="360" w:lineRule="auto"/>
         <w:ind w:left="410"/>
-        <w:jc w:val="center"/>
-        <w:rPr>
-          <w:b/>
-          <w:bCs/>
-          <w:sz w:val="28"/>
-          <w:szCs w:val="28"/>
-        </w:rPr>
-      </w:pPr>
+        <w:rPr>
+          <w:b/>
+          <w:bCs/>
+        </w:rPr>
+      </w:pPr>
+      <w:r>
+        <w:rPr>
+          <w:b/>
+          <w:bCs/>
+        </w:rPr>
+        <w:t>Create a class Book with a default constructor, parameterized constructor, copy constructor, and destructor. Create multiple objects using different initialization techniques.</w:t>
+      </w:r>
     </w:p>
     <w:p>
       <w:pPr>
@@ -1086,17 +1614,9 @@
         </w:tabs>
         <w:spacing w:line="360" w:lineRule="auto"/>
         <w:ind w:left="410"/>
-        <w:rPr>
-          <w:b/>
-          <w:bCs/>
-        </w:rPr>
-      </w:pPr>
-      <w:r>
-        <w:rPr>
-          <w:b/>
-          <w:bCs/>
-        </w:rPr>
-        <w:t>Create a class Book with a default constructor, parameterized constructor, copy constructor, and destructor. Create multiple objects using different initialization techniques.</w:t>
+      </w:pPr>
+      <w:r>
+        <w:t xml:space="preserve"> • Implement class Book with all four special member functions.</w:t>
       </w:r>
     </w:p>
     <w:p>
@@ -1109,7 +1629,7 @@
         <w:ind w:left="410"/>
       </w:pPr>
       <w:r>
-        <w:t xml:space="preserve"> • Implement class Book with all four special member functions.</w:t>
+        <w:t xml:space="preserve"> • Create objects using default construction, parameterized construction, and copy construction. </w:t>
       </w:r>
     </w:p>
     <w:p>
@@ -1122,20 +1642,6 @@
         <w:ind w:left="410"/>
       </w:pPr>
       <w:r>
-        <w:t xml:space="preserve"> • Create objects using default construction, parameterized construction, and copy construction. </w:t>
-      </w:r>
-    </w:p>
-    <w:p>
-      <w:pPr>
-        <w:pStyle w:val="ListParagraph"/>
-        <w:tabs>
-          <w:tab w:val="left" w:pos="7410"/>
-        </w:tabs>
-        <w:spacing w:line="360" w:lineRule="auto"/>
-        <w:ind w:left="410"/>
-      </w:pPr>
-      <w:r>
-        <w:lastRenderedPageBreak/>
         <w:t xml:space="preserve">• Use different copy syntax: Book b2 = b1; and Book b3(b1);. </w:t>
       </w:r>
     </w:p>
@@ -1171,7 +1677,7 @@
                     </pic:cNvPicPr>
                   </pic:nvPicPr>
                   <pic:blipFill>
-                    <a:blip r:embed="rId9">
+                    <a:blip r:embed="rId10">
                       <a:extLst>
                         <a:ext uri="{28A0092B-C50C-407E-A947-70E740481C1C}">
                           <a14:useLocalDpi xmlns:a14="http://schemas.microsoft.com/office/drawing/2010/main" val="0"/>
@@ -1217,6 +1723,7 @@
         <w:rPr>
           <w:noProof/>
         </w:rPr>
+        <w:lastRenderedPageBreak/>
         <w:drawing>
           <wp:inline distT="0" distB="0" distL="0" distR="0" wp14:anchorId="30F983DC" wp14:editId="7B18D3E7">
             <wp:extent cx="5727428" cy="2030506"/>
@@ -1235,7 +1742,7 @@
                     </pic:cNvPicPr>
                   </pic:nvPicPr>
                   <pic:blipFill>
-                    <a:blip r:embed="rId10">
+                    <a:blip r:embed="rId11">
                       <a:extLst>
                         <a:ext uri="{28A0092B-C50C-407E-A947-70E740481C1C}">
                           <a14:useLocalDpi xmlns:a14="http://schemas.microsoft.com/office/drawing/2010/main" val="0"/>
@@ -1339,9 +1846,13 @@
         <w:spacing w:line="360" w:lineRule="auto"/>
       </w:pPr>
       <w:r>
-        <w:lastRenderedPageBreak/>
-        <w:t>Book b2 = b1;</w:t>
-      </w:r>
+        <w:t xml:space="preserve">Book b2 = </w:t>
+      </w:r>
+      <w:proofErr w:type="gramStart"/>
+      <w:r>
+        <w:t>b1;</w:t>
+      </w:r>
+      <w:proofErr w:type="gramEnd"/>
     </w:p>
     <w:p>
       <w:pPr>
@@ -1356,8 +1867,13 @@
         <w:spacing w:line="360" w:lineRule="auto"/>
       </w:pPr>
       <w:r>
-        <w:t>Book b3(b1);</w:t>
-      </w:r>
+        <w:t>Book b3(b1</w:t>
+      </w:r>
+      <w:proofErr w:type="gramStart"/>
+      <w:r>
+        <w:t>);</w:t>
+      </w:r>
+      <w:proofErr w:type="gramEnd"/>
     </w:p>
     <w:p>
       <w:pPr>
@@ -1583,6 +2099,7 @@
         <w:spacing w:line="360" w:lineRule="auto"/>
       </w:pPr>
       <w:r>
+        <w:lastRenderedPageBreak/>
         <w:t>They can have the same data, but they are stored in different places in memory.</w:t>
       </w:r>
     </w:p>
@@ -1612,38 +2129,38 @@
         <w:rPr>
           <w:b/>
           <w:bCs/>
+          <w:sz w:val="32"/>
+          <w:szCs w:val="32"/>
+        </w:rPr>
+      </w:pPr>
+      <w:r>
+        <w:rPr>
+          <w:b/>
+          <w:bCs/>
+          <w:sz w:val="32"/>
+          <w:szCs w:val="32"/>
+        </w:rPr>
+        <w:t>Task 5: Object Composition</w:t>
+      </w:r>
+    </w:p>
+    <w:p>
+      <w:pPr>
+        <w:tabs>
+          <w:tab w:val="left" w:pos="7410"/>
+        </w:tabs>
+        <w:spacing w:line="360" w:lineRule="auto"/>
+        <w:rPr>
+          <w:b/>
+          <w:bCs/>
+        </w:rPr>
+      </w:pPr>
+      <w:r>
+        <w:rPr>
+          <w:b/>
+          <w:bCs/>
           <w:sz w:val="28"/>
           <w:szCs w:val="28"/>
         </w:rPr>
-      </w:pPr>
-      <w:r>
-        <w:rPr>
-          <w:b/>
-          <w:bCs/>
-          <w:sz w:val="28"/>
-          <w:szCs w:val="28"/>
-        </w:rPr>
-        <w:t>Task 5: Object Composition</w:t>
-      </w:r>
-    </w:p>
-    <w:p>
-      <w:pPr>
-        <w:tabs>
-          <w:tab w:val="left" w:pos="7410"/>
-        </w:tabs>
-        <w:spacing w:line="360" w:lineRule="auto"/>
-        <w:rPr>
-          <w:b/>
-          <w:bCs/>
-        </w:rPr>
-      </w:pPr>
-      <w:r>
-        <w:rPr>
-          <w:b/>
-          <w:bCs/>
-          <w:sz w:val="28"/>
-          <w:szCs w:val="28"/>
-        </w:rPr>
         <w:t xml:space="preserve"> </w:t>
       </w:r>
       <w:r>
@@ -1699,7 +2216,6 @@
         <w:rPr>
           <w:noProof/>
         </w:rPr>
-        <w:lastRenderedPageBreak/>
         <w:drawing>
           <wp:inline distT="0" distB="0" distL="0" distR="0" wp14:anchorId="513A9DB0" wp14:editId="2A4BF47F">
             <wp:extent cx="5345430" cy="4056185"/>
@@ -1718,7 +2234,7 @@
                     </pic:cNvPicPr>
                   </pic:nvPicPr>
                   <pic:blipFill>
-                    <a:blip r:embed="rId11">
+                    <a:blip r:embed="rId12">
                       <a:extLst>
                         <a:ext uri="{28A0092B-C50C-407E-A947-70E740481C1C}">
                           <a14:useLocalDpi xmlns:a14="http://schemas.microsoft.com/office/drawing/2010/main" val="0"/>
@@ -1762,6 +2278,7 @@
         <w:rPr>
           <w:noProof/>
         </w:rPr>
+        <w:lastRenderedPageBreak/>
         <w:drawing>
           <wp:inline distT="0" distB="0" distL="0" distR="0" wp14:anchorId="49430E4A" wp14:editId="7D4DB694">
             <wp:extent cx="5345430" cy="1524000"/>
@@ -1780,7 +2297,7 @@
                     </pic:cNvPicPr>
                   </pic:nvPicPr>
                   <pic:blipFill>
-                    <a:blip r:embed="rId12">
+                    <a:blip r:embed="rId13">
                       <a:extLst>
                         <a:ext uri="{28A0092B-C50C-407E-A947-70E740481C1C}">
                           <a14:useLocalDpi xmlns:a14="http://schemas.microsoft.com/office/drawing/2010/main" val="0"/>
@@ -1871,7 +2388,15 @@
         <w:t xml:space="preserve">  </w:t>
       </w:r>
       <w:r>
-        <w:t>constructed before the Car constructor body runs. Since Engine is a member inside Car, it is created first.</w:t>
+        <w:t xml:space="preserve">constructed before the Car constructor body runs. Since Engine is a member inside Car, it </w:t>
+      </w:r>
+      <w:proofErr w:type="gramStart"/>
+      <w:r>
+        <w:t>is</w:t>
+      </w:r>
+      <w:proofErr w:type="gramEnd"/>
+      <w:r>
+        <w:t xml:space="preserve"> created first.</w:t>
       </w:r>
     </w:p>
     <w:p>
@@ -1901,7 +2426,6 @@
         <w:spacing w:line="360" w:lineRule="auto"/>
       </w:pPr>
       <w:r>
-        <w:lastRenderedPageBreak/>
         <w:t>The Car destructor runs first. When the Car object’s life ends, its destructor runs, and after that the Engine destructor runs automatically. Member objects are destroyed after the outer object.</w:t>
       </w:r>
     </w:p>
@@ -2009,24 +2533,30 @@
         <w:rPr>
           <w:b/>
           <w:bCs/>
-        </w:rPr>
-      </w:pPr>
-    </w:p>
-    <w:p>
-      <w:pPr>
-        <w:tabs>
-          <w:tab w:val="left" w:pos="7410"/>
-        </w:tabs>
-        <w:spacing w:line="360" w:lineRule="auto"/>
-        <w:rPr>
-          <w:b/>
-          <w:bCs/>
-        </w:rPr>
-      </w:pPr>
-      <w:r>
-        <w:rPr>
-          <w:b/>
-          <w:bCs/>
+          <w:sz w:val="36"/>
+          <w:szCs w:val="36"/>
+        </w:rPr>
+      </w:pPr>
+    </w:p>
+    <w:p>
+      <w:pPr>
+        <w:tabs>
+          <w:tab w:val="left" w:pos="7410"/>
+        </w:tabs>
+        <w:spacing w:line="360" w:lineRule="auto"/>
+        <w:rPr>
+          <w:b/>
+          <w:bCs/>
+          <w:sz w:val="36"/>
+          <w:szCs w:val="36"/>
+        </w:rPr>
+      </w:pPr>
+      <w:r>
+        <w:rPr>
+          <w:b/>
+          <w:bCs/>
+          <w:sz w:val="36"/>
+          <w:szCs w:val="36"/>
         </w:rPr>
         <w:t xml:space="preserve">                      </w:t>
       </w:r>
@@ -2034,8 +2564,8 @@
         <w:rPr>
           <w:b/>
           <w:bCs/>
-          <w:sz w:val="28"/>
-          <w:szCs w:val="28"/>
+          <w:sz w:val="36"/>
+          <w:szCs w:val="36"/>
         </w:rPr>
         <w:t xml:space="preserve">     </w:t>
       </w:r>
@@ -2043,8 +2573,8 @@
         <w:rPr>
           <w:b/>
           <w:bCs/>
-          <w:sz w:val="28"/>
-          <w:szCs w:val="28"/>
+          <w:sz w:val="36"/>
+          <w:szCs w:val="36"/>
         </w:rPr>
         <w:t>Task 8: Pointer Reassignment &amp; Memory Leak</w:t>
       </w:r>
@@ -2119,7 +2649,6 @@
         <w:rPr>
           <w:noProof/>
         </w:rPr>
-        <w:lastRenderedPageBreak/>
         <w:drawing>
           <wp:inline distT="0" distB="0" distL="0" distR="0" wp14:anchorId="71B9DE44" wp14:editId="6CA25AF1">
             <wp:extent cx="5943600" cy="4384713"/>
@@ -2138,7 +2667,7 @@
                     </pic:cNvPicPr>
                   </pic:nvPicPr>
                   <pic:blipFill>
-                    <a:blip r:embed="rId13">
+                    <a:blip r:embed="rId14">
                       <a:extLst>
                         <a:ext uri="{28A0092B-C50C-407E-A947-70E740481C1C}">
                           <a14:useLocalDpi xmlns:a14="http://schemas.microsoft.com/office/drawing/2010/main" val="0"/>
@@ -2182,6 +2711,7 @@
         <w:rPr>
           <w:noProof/>
         </w:rPr>
+        <w:lastRenderedPageBreak/>
         <w:drawing>
           <wp:inline distT="0" distB="0" distL="0" distR="0" wp14:anchorId="3561833E" wp14:editId="75D4A199">
             <wp:extent cx="3888954" cy="1364615"/>
@@ -2200,7 +2730,7 @@
                     </pic:cNvPicPr>
                   </pic:nvPicPr>
                   <pic:blipFill>
-                    <a:blip r:embed="rId14">
+                    <a:blip r:embed="rId15">
                       <a:extLst>
                         <a:ext uri="{28A0092B-C50C-407E-A947-70E740481C1C}">
                           <a14:useLocalDpi xmlns:a14="http://schemas.microsoft.com/office/drawing/2010/main" val="0"/>
@@ -2308,81 +2838,89 @@
         <w:spacing w:line="360" w:lineRule="auto"/>
       </w:pPr>
       <w:r>
+        <w:t>The first object created Object 1becomes unreachable. We have no pointer to it anymore after reassigning a to b.</w:t>
+      </w:r>
+    </w:p>
+    <w:p>
+      <w:pPr>
+        <w:tabs>
+          <w:tab w:val="left" w:pos="7410"/>
+        </w:tabs>
+        <w:spacing w:line="360" w:lineRule="auto"/>
+        <w:rPr>
+          <w:b/>
+          <w:bCs/>
+        </w:rPr>
+      </w:pPr>
+      <w:r>
+        <w:rPr>
+          <w:b/>
+          <w:bCs/>
+        </w:rPr>
+        <w:t xml:space="preserve">3. Which destructor executes? </w:t>
+      </w:r>
+    </w:p>
+    <w:p>
+      <w:pPr>
+        <w:tabs>
+          <w:tab w:val="left" w:pos="7410"/>
+        </w:tabs>
+        <w:spacing w:line="360" w:lineRule="auto"/>
+      </w:pPr>
+      <w:r>
+        <w:t xml:space="preserve">Only the destructor of the object pointed to by </w:t>
+      </w:r>
+      <w:proofErr w:type="gramStart"/>
+      <w:r>
+        <w:t>a</w:t>
+      </w:r>
+      <w:proofErr w:type="gramEnd"/>
+      <w:r>
+        <w:t xml:space="preserve"> after reassignment Object 2 executes when we call delete a;. The destructor of the first object never runs, causing a memory leak.</w:t>
+      </w:r>
+    </w:p>
+    <w:p>
+      <w:pPr>
+        <w:tabs>
+          <w:tab w:val="left" w:pos="7410"/>
+        </w:tabs>
+        <w:spacing w:line="360" w:lineRule="auto"/>
+        <w:rPr>
+          <w:b/>
+          <w:bCs/>
+        </w:rPr>
+      </w:pPr>
+      <w:r>
+        <w:rPr>
+          <w:b/>
+          <w:bCs/>
+        </w:rPr>
+        <w:t>4. Fix the code and explain your correction.</w:t>
+      </w:r>
+      <w:r>
+        <w:rPr>
+          <w:b/>
+          <w:bCs/>
+        </w:rPr>
+        <w:t xml:space="preserve">      </w:t>
+      </w:r>
+    </w:p>
+    <w:p>
+      <w:pPr>
+        <w:tabs>
+          <w:tab w:val="left" w:pos="7410"/>
+        </w:tabs>
+        <w:spacing w:line="360" w:lineRule="auto"/>
+        <w:jc w:val="center"/>
+        <w:rPr>
+          <w:noProof/>
+        </w:rPr>
+      </w:pPr>
+      <w:r>
+        <w:rPr>
+          <w:noProof/>
+        </w:rPr>
         <w:lastRenderedPageBreak/>
-        <w:t>The first object created Object 1becomes unreachable. We have no pointer to it anymore after reassigning a to b.</w:t>
-      </w:r>
-    </w:p>
-    <w:p>
-      <w:pPr>
-        <w:tabs>
-          <w:tab w:val="left" w:pos="7410"/>
-        </w:tabs>
-        <w:spacing w:line="360" w:lineRule="auto"/>
-        <w:rPr>
-          <w:b/>
-          <w:bCs/>
-        </w:rPr>
-      </w:pPr>
-      <w:r>
-        <w:rPr>
-          <w:b/>
-          <w:bCs/>
-        </w:rPr>
-        <w:t xml:space="preserve">3. Which destructor executes? </w:t>
-      </w:r>
-    </w:p>
-    <w:p>
-      <w:pPr>
-        <w:tabs>
-          <w:tab w:val="left" w:pos="7410"/>
-        </w:tabs>
-        <w:spacing w:line="360" w:lineRule="auto"/>
-      </w:pPr>
-      <w:r>
-        <w:t>Only the destructor of the object pointed to by a after reassignment Object 2 executes when we call delete a;. The destructor of the first object never runs, causing a memory leak.</w:t>
-      </w:r>
-    </w:p>
-    <w:p>
-      <w:pPr>
-        <w:tabs>
-          <w:tab w:val="left" w:pos="7410"/>
-        </w:tabs>
-        <w:spacing w:line="360" w:lineRule="auto"/>
-        <w:rPr>
-          <w:b/>
-          <w:bCs/>
-        </w:rPr>
-      </w:pPr>
-      <w:r>
-        <w:rPr>
-          <w:b/>
-          <w:bCs/>
-        </w:rPr>
-        <w:t>4. Fix the code and explain your correction.</w:t>
-      </w:r>
-      <w:r>
-        <w:rPr>
-          <w:b/>
-          <w:bCs/>
-        </w:rPr>
-        <w:t xml:space="preserve">      </w:t>
-      </w:r>
-    </w:p>
-    <w:p>
-      <w:pPr>
-        <w:tabs>
-          <w:tab w:val="left" w:pos="7410"/>
-        </w:tabs>
-        <w:spacing w:line="360" w:lineRule="auto"/>
-        <w:jc w:val="center"/>
-        <w:rPr>
-          <w:noProof/>
-        </w:rPr>
-      </w:pPr>
-      <w:r>
-        <w:rPr>
-          <w:noProof/>
-        </w:rPr>
         <w:drawing>
           <wp:inline distT="0" distB="0" distL="0" distR="0" wp14:anchorId="1E696613" wp14:editId="4C7D9C2D">
             <wp:extent cx="5051834" cy="4164330"/>
@@ -2401,7 +2939,7 @@
                     </pic:cNvPicPr>
                   </pic:nvPicPr>
                   <pic:blipFill>
-                    <a:blip r:embed="rId15">
+                    <a:blip r:embed="rId16">
                       <a:extLst>
                         <a:ext uri="{28A0092B-C50C-407E-A947-70E740481C1C}">
                           <a14:useLocalDpi xmlns:a14="http://schemas.microsoft.com/office/drawing/2010/main" val="0"/>
@@ -2514,11 +3052,16 @@
     </w:p>
     <w:p>
       <w:pPr>
-        <w:tabs>
-          <w:tab w:val="left" w:pos="7410"/>
-        </w:tabs>
-        <w:spacing w:line="360" w:lineRule="auto"/>
-        <w:rPr>
+        <w:pBdr>
+          <w:top w:val="single" w:sz="12" w:space="1" w:color="auto"/>
+        </w:pBdr>
+        <w:tabs>
+          <w:tab w:val="left" w:pos="7410"/>
+        </w:tabs>
+        <w:spacing w:line="360" w:lineRule="auto"/>
+        <w:rPr>
+          <w:b/>
+          <w:bCs/>
           <w:noProof/>
         </w:rPr>
       </w:pPr>

</xml_diff>